<commit_message>
docs: add line-by-line walkthrough, update lab 2 report, list branches
</commit_message>
<xml_diff>
--- a/airp/lab2/report/Отчет_ЛР2.docx
+++ b/airp/lab2/report/Отчет_ЛР2.docx
@@ -297,7 +297,7 @@
       <w:r>
         <w:fldChar w:fldCharType="separate"/>
       </w:r>
-      <w:hyperlink w:anchor="_Toc242386431" w:history="1">
+      <w:hyperlink w:anchor="_Toc242426566" w:history="1">
         <w:r>
           <w:rPr>
             <w:rStyle w:val="aff8"/>
@@ -324,7 +324,7 @@
             <w:noProof/>
             <w:webHidden/>
           </w:rPr>
-          <w:instrText xml:space="preserve"> PAGEREF _Toc242386431 \h </w:instrText>
+          <w:instrText xml:space="preserve"> PAGEREF _Toc242426566 \h </w:instrText>
         </w:r>
         <w:r>
           <w:rPr>
@@ -370,7 +370,7 @@
           <w14:ligatures w14:val="standardContextual"/>
         </w:rPr>
       </w:pPr>
-      <w:hyperlink w:anchor="_Toc242386432" w:history="1">
+      <w:hyperlink w:anchor="_Toc242426567" w:history="1">
         <w:r>
           <w:rPr>
             <w:rStyle w:val="aff8"/>
@@ -397,7 +397,7 @@
             <w:noProof/>
             <w:webHidden/>
           </w:rPr>
-          <w:instrText xml:space="preserve"> PAGEREF _Toc242386432 \h </w:instrText>
+          <w:instrText xml:space="preserve"> PAGEREF _Toc242426567 \h </w:instrText>
         </w:r>
         <w:r>
           <w:rPr>
@@ -443,7 +443,7 @@
           <w14:ligatures w14:val="standardContextual"/>
         </w:rPr>
       </w:pPr>
-      <w:hyperlink w:anchor="_Toc242386433" w:history="1">
+      <w:hyperlink w:anchor="_Toc242426568" w:history="1">
         <w:r>
           <w:rPr>
             <w:rStyle w:val="aff8"/>
@@ -470,7 +470,7 @@
             <w:noProof/>
             <w:webHidden/>
           </w:rPr>
-          <w:instrText xml:space="preserve"> PAGEREF _Toc242386433 \h </w:instrText>
+          <w:instrText xml:space="preserve"> PAGEREF _Toc242426568 \h </w:instrText>
         </w:r>
         <w:r>
           <w:rPr>
@@ -516,7 +516,7 @@
           <w14:ligatures w14:val="standardContextual"/>
         </w:rPr>
       </w:pPr>
-      <w:hyperlink w:anchor="_Toc242386434" w:history="1">
+      <w:hyperlink w:anchor="_Toc242426569" w:history="1">
         <w:r>
           <w:rPr>
             <w:rStyle w:val="aff8"/>
@@ -543,7 +543,7 @@
             <w:noProof/>
             <w:webHidden/>
           </w:rPr>
-          <w:instrText xml:space="preserve"> PAGEREF _Toc242386434 \h </w:instrText>
+          <w:instrText xml:space="preserve"> PAGEREF _Toc242426569 \h </w:instrText>
         </w:r>
         <w:r>
           <w:rPr>
@@ -589,7 +589,7 @@
           <w14:ligatures w14:val="standardContextual"/>
         </w:rPr>
       </w:pPr>
-      <w:hyperlink w:anchor="_Toc242386435" w:history="1">
+      <w:hyperlink w:anchor="_Toc242426570" w:history="1">
         <w:r>
           <w:rPr>
             <w:rStyle w:val="aff8"/>
@@ -616,7 +616,7 @@
             <w:noProof/>
             <w:webHidden/>
           </w:rPr>
-          <w:instrText xml:space="preserve"> PAGEREF _Toc242386435 \h </w:instrText>
+          <w:instrText xml:space="preserve"> PAGEREF _Toc242426570 \h </w:instrText>
         </w:r>
         <w:r>
           <w:rPr>
@@ -662,7 +662,7 @@
           <w14:ligatures w14:val="standardContextual"/>
         </w:rPr>
       </w:pPr>
-      <w:hyperlink w:anchor="_Toc242386436" w:history="1">
+      <w:hyperlink w:anchor="_Toc242426571" w:history="1">
         <w:r>
           <w:rPr>
             <w:rStyle w:val="aff8"/>
@@ -689,7 +689,7 @@
             <w:noProof/>
             <w:webHidden/>
           </w:rPr>
-          <w:instrText xml:space="preserve"> PAGEREF _Toc242386436 \h </w:instrText>
+          <w:instrText xml:space="preserve"> PAGEREF _Toc242426571 \h </w:instrText>
         </w:r>
         <w:r>
           <w:rPr>
@@ -735,7 +735,7 @@
           <w14:ligatures w14:val="standardContextual"/>
         </w:rPr>
       </w:pPr>
-      <w:hyperlink w:anchor="_Toc242386437" w:history="1">
+      <w:hyperlink w:anchor="_Toc242426572" w:history="1">
         <w:r>
           <w:rPr>
             <w:rStyle w:val="aff8"/>
@@ -762,7 +762,7 @@
             <w:noProof/>
             <w:webHidden/>
           </w:rPr>
-          <w:instrText xml:space="preserve"> PAGEREF _Toc242386437 \h </w:instrText>
+          <w:instrText xml:space="preserve"> PAGEREF _Toc242426572 \h </w:instrText>
         </w:r>
         <w:r>
           <w:rPr>
@@ -808,7 +808,7 @@
           <w14:ligatures w14:val="standardContextual"/>
         </w:rPr>
       </w:pPr>
-      <w:hyperlink w:anchor="_Toc242386438" w:history="1">
+      <w:hyperlink w:anchor="_Toc242426573" w:history="1">
         <w:r>
           <w:rPr>
             <w:rStyle w:val="aff8"/>
@@ -835,7 +835,7 @@
             <w:noProof/>
             <w:webHidden/>
           </w:rPr>
-          <w:instrText xml:space="preserve"> PAGEREF _Toc242386438 \h </w:instrText>
+          <w:instrText xml:space="preserve"> PAGEREF _Toc242426573 \h </w:instrText>
         </w:r>
         <w:r>
           <w:rPr>
@@ -881,7 +881,7 @@
           <w14:ligatures w14:val="standardContextual"/>
         </w:rPr>
       </w:pPr>
-      <w:hyperlink w:anchor="_Toc242386439" w:history="1">
+      <w:hyperlink w:anchor="_Toc242426574" w:history="1">
         <w:r>
           <w:rPr>
             <w:rStyle w:val="aff8"/>
@@ -938,7 +938,7 @@
             <w:noProof/>
             <w:webHidden/>
           </w:rPr>
-          <w:instrText xml:space="preserve"> PAGEREF _Toc242386439 \h </w:instrText>
+          <w:instrText xml:space="preserve"> PAGEREF _Toc242426574 \h </w:instrText>
         </w:r>
         <w:r>
           <w:rPr>
@@ -984,7 +984,7 @@
           <w14:ligatures w14:val="standardContextual"/>
         </w:rPr>
       </w:pPr>
-      <w:hyperlink w:anchor="_Toc242386440" w:history="1">
+      <w:hyperlink w:anchor="_Toc242426575" w:history="1">
         <w:r>
           <w:rPr>
             <w:rStyle w:val="aff8"/>
@@ -1011,7 +1011,7 @@
             <w:noProof/>
             <w:webHidden/>
           </w:rPr>
-          <w:instrText xml:space="preserve"> PAGEREF _Toc242386440 \h </w:instrText>
+          <w:instrText xml:space="preserve"> PAGEREF _Toc242426575 \h </w:instrText>
         </w:r>
         <w:r>
           <w:rPr>
@@ -1057,7 +1057,7 @@
           <w14:ligatures w14:val="standardContextual"/>
         </w:rPr>
       </w:pPr>
-      <w:hyperlink w:anchor="_Toc242386441" w:history="1">
+      <w:hyperlink w:anchor="_Toc242426576" w:history="1">
         <w:r>
           <w:rPr>
             <w:rStyle w:val="aff8"/>
@@ -1084,7 +1084,7 @@
             <w:noProof/>
             <w:webHidden/>
           </w:rPr>
-          <w:instrText xml:space="preserve"> PAGEREF _Toc242386441 \h </w:instrText>
+          <w:instrText xml:space="preserve"> PAGEREF _Toc242426576 \h </w:instrText>
         </w:r>
         <w:r>
           <w:rPr>
@@ -1130,7 +1130,7 @@
           <w14:ligatures w14:val="standardContextual"/>
         </w:rPr>
       </w:pPr>
-      <w:hyperlink w:anchor="_Toc242386442" w:history="1">
+      <w:hyperlink w:anchor="_Toc242426577" w:history="1">
         <w:r>
           <w:rPr>
             <w:rStyle w:val="aff8"/>
@@ -1157,7 +1157,7 @@
             <w:noProof/>
             <w:webHidden/>
           </w:rPr>
-          <w:instrText xml:space="preserve"> PAGEREF _Toc242386442 \h </w:instrText>
+          <w:instrText xml:space="preserve"> PAGEREF _Toc242426577 \h </w:instrText>
         </w:r>
         <w:r>
           <w:rPr>
@@ -1203,7 +1203,7 @@
           <w14:ligatures w14:val="standardContextual"/>
         </w:rPr>
       </w:pPr>
-      <w:hyperlink w:anchor="_Toc242386443" w:history="1">
+      <w:hyperlink w:anchor="_Toc242426578" w:history="1">
         <w:r>
           <w:rPr>
             <w:rStyle w:val="aff8"/>
@@ -1230,7 +1230,7 @@
             <w:noProof/>
             <w:webHidden/>
           </w:rPr>
-          <w:instrText xml:space="preserve"> PAGEREF _Toc242386443 \h </w:instrText>
+          <w:instrText xml:space="preserve"> PAGEREF _Toc242426578 \h </w:instrText>
         </w:r>
         <w:r>
           <w:rPr>
@@ -1276,7 +1276,7 @@
         <w:pStyle w:val="1"/>
         <w:ind w:firstLine="709"/>
       </w:pPr>
-      <w:bookmarkStart w:id="0" w:name="_Toc242386431"/>
+      <w:bookmarkStart w:id="0" w:name="_Toc242426566"/>
       <w:r>
         <w:rPr>
           <w:rFonts w:ascii="Times New Roman" w:hAnsi="Times New Roman"/>
@@ -1314,7 +1314,7 @@
         <w:pStyle w:val="1"/>
         <w:ind w:firstLine="709"/>
       </w:pPr>
-      <w:bookmarkStart w:id="1" w:name="_Toc242386432"/>
+      <w:bookmarkStart w:id="1" w:name="_Toc242426567"/>
       <w:r>
         <w:rPr>
           <w:rFonts w:ascii="Times New Roman" w:hAnsi="Times New Roman"/>
@@ -1505,7 +1505,7 @@
         <w:pStyle w:val="1"/>
         <w:ind w:firstLine="709"/>
       </w:pPr>
-      <w:bookmarkStart w:id="2" w:name="_Toc242386433"/>
+      <w:bookmarkStart w:id="2" w:name="_Toc242426568"/>
       <w:r>
         <w:rPr>
           <w:rFonts w:ascii="Times New Roman" w:hAnsi="Times New Roman"/>
@@ -1521,7 +1521,7 @@
         <w:spacing w:before="360"/>
         <w:ind w:firstLine="709"/>
       </w:pPr>
-      <w:bookmarkStart w:id="3" w:name="_Toc242386434"/>
+      <w:bookmarkStart w:id="3" w:name="_Toc242426569"/>
       <w:r>
         <w:rPr>
           <w:rFonts w:ascii="Times New Roman" w:hAnsi="Times New Roman"/>
@@ -1662,7 +1662,7 @@
         <w:spacing w:before="360"/>
         <w:ind w:firstLine="709"/>
       </w:pPr>
-      <w:bookmarkStart w:id="4" w:name="_Toc242386435"/>
+      <w:bookmarkStart w:id="4" w:name="_Toc242426570"/>
       <w:r>
         <w:rPr>
           <w:rFonts w:ascii="Times New Roman" w:hAnsi="Times New Roman"/>
@@ -3264,7 +3264,7 @@
         <w:spacing w:before="360"/>
         <w:ind w:firstLine="709"/>
       </w:pPr>
-      <w:bookmarkStart w:id="5" w:name="_Toc242386436"/>
+      <w:bookmarkStart w:id="5" w:name="_Toc242426571"/>
       <w:r>
         <w:rPr>
           <w:rFonts w:ascii="Times New Roman" w:hAnsi="Times New Roman"/>
@@ -3294,7 +3294,7 @@
         </w:rPr>
         <w:lastRenderedPageBreak/>
         <w:drawing>
-          <wp:inline distT="0" distB="0" distL="0" distR="0" wp14:anchorId="199AE908" wp14:editId="66EA9545">
+          <wp:inline distT="0" distB="0" distL="0" distR="0" wp14:anchorId="7B47F745" wp14:editId="12E604DC">
             <wp:extent cx="5580000" cy="3560156"/>
             <wp:effectExtent l="0" t="0" r="0" b="0"/>
             <wp:docPr id="1" name="Picture 1"/>
@@ -3378,7 +3378,7 @@
           <w:noProof/>
         </w:rPr>
         <w:drawing>
-          <wp:inline distT="0" distB="0" distL="0" distR="0" wp14:anchorId="506D6F34" wp14:editId="114FF064">
+          <wp:inline distT="0" distB="0" distL="0" distR="0" wp14:anchorId="1D5529E4" wp14:editId="6734CB9E">
             <wp:extent cx="5580000" cy="3560156"/>
             <wp:effectExtent l="0" t="0" r="0" b="0"/>
             <wp:docPr id="2" name="Picture 2"/>
@@ -3453,7 +3453,7 @@
           <w:noProof/>
         </w:rPr>
         <w:drawing>
-          <wp:inline distT="0" distB="0" distL="0" distR="0" wp14:anchorId="42C5DF48" wp14:editId="3C13946A">
+          <wp:inline distT="0" distB="0" distL="0" distR="0" wp14:anchorId="6F746AA6" wp14:editId="602C64FA">
             <wp:extent cx="5580000" cy="3560156"/>
             <wp:effectExtent l="0" t="0" r="0" b="0"/>
             <wp:docPr id="3" name="Picture 3"/>
@@ -3529,7 +3529,7 @@
         </w:rPr>
         <w:lastRenderedPageBreak/>
         <w:drawing>
-          <wp:inline distT="0" distB="0" distL="0" distR="0" wp14:anchorId="56317661" wp14:editId="42975934">
+          <wp:inline distT="0" distB="0" distL="0" distR="0" wp14:anchorId="222AC2A2" wp14:editId="5D798556">
             <wp:extent cx="5580000" cy="3560156"/>
             <wp:effectExtent l="0" t="0" r="0" b="0"/>
             <wp:docPr id="4" name="Picture 4"/>
@@ -3605,7 +3605,7 @@
         </w:rPr>
         <w:lastRenderedPageBreak/>
         <w:drawing>
-          <wp:inline distT="0" distB="0" distL="0" distR="0" wp14:anchorId="4346044B" wp14:editId="701F9A5E">
+          <wp:inline distT="0" distB="0" distL="0" distR="0" wp14:anchorId="19FD0ED5" wp14:editId="1C2ECC03">
             <wp:extent cx="5580000" cy="3560156"/>
             <wp:effectExtent l="0" t="0" r="0" b="0"/>
             <wp:docPr id="5" name="Picture 5"/>
@@ -3666,7 +3666,7 @@
         <w:spacing w:before="360"/>
         <w:ind w:firstLine="709"/>
       </w:pPr>
-      <w:bookmarkStart w:id="6" w:name="_Toc242386437"/>
+      <w:bookmarkStart w:id="6" w:name="_Toc242426572"/>
       <w:r>
         <w:rPr>
           <w:rFonts w:ascii="Times New Roman" w:hAnsi="Times New Roman"/>
@@ -3690,16 +3690,7 @@
         <w:t>Windows</w:t>
       </w:r>
       <w:r>
-        <w:t xml:space="preserve">, клиенты на </w:t>
-      </w:r>
-      <w:r>
-        <w:rPr>
-          <w:i/>
-        </w:rPr>
-        <w:t>Mac</w:t>
-      </w:r>
-      <w:r>
-        <w:t xml:space="preserve"> и на </w:t>
+        <w:t xml:space="preserve">, клиент в </w:t>
       </w:r>
       <w:r>
         <w:rPr>
@@ -3763,9 +3754,9 @@
         <w:tblLook w:val="04A0" w:firstRow="1" w:lastRow="0" w:firstColumn="1" w:lastColumn="0" w:noHBand="0" w:noVBand="1"/>
       </w:tblPr>
       <w:tblGrid>
-        <w:gridCol w:w="2274"/>
-        <w:gridCol w:w="2898"/>
-        <w:gridCol w:w="4183"/>
+        <w:gridCol w:w="1965"/>
+        <w:gridCol w:w="2991"/>
+        <w:gridCol w:w="4399"/>
       </w:tblGrid>
       <w:tr>
         <w:trPr>
@@ -3775,7 +3766,7 @@
         </w:trPr>
         <w:tc>
           <w:tcPr>
-            <w:tcW w:w="2273" w:type="dxa"/>
+            <w:tcW w:w="1964" w:type="dxa"/>
           </w:tcPr>
           <w:p>
             <w:pPr>
@@ -3793,7 +3784,7 @@
         </w:tc>
         <w:tc>
           <w:tcPr>
-            <w:tcW w:w="2898" w:type="dxa"/>
+            <w:tcW w:w="2991" w:type="dxa"/>
           </w:tcPr>
           <w:p>
             <w:pPr>
@@ -3811,7 +3802,7 @@
         </w:tc>
         <w:tc>
           <w:tcPr>
-            <w:tcW w:w="4183" w:type="dxa"/>
+            <w:tcW w:w="4399" w:type="dxa"/>
           </w:tcPr>
           <w:p>
             <w:pPr>
@@ -3835,7 +3826,7 @@
         </w:trPr>
         <w:tc>
           <w:tcPr>
-            <w:tcW w:w="2273" w:type="dxa"/>
+            <w:tcW w:w="1964" w:type="dxa"/>
           </w:tcPr>
           <w:p>
             <w:pPr>
@@ -3859,7 +3850,7 @@
         </w:tc>
         <w:tc>
           <w:tcPr>
-            <w:tcW w:w="2898" w:type="dxa"/>
+            <w:tcW w:w="2991" w:type="dxa"/>
           </w:tcPr>
           <w:p>
             <w:pPr>
@@ -3890,7 +3881,7 @@
         </w:tc>
         <w:tc>
           <w:tcPr>
-            <w:tcW w:w="4183" w:type="dxa"/>
+            <w:tcW w:w="4399" w:type="dxa"/>
           </w:tcPr>
           <w:p>
             <w:pPr>
@@ -3926,26 +3917,13 @@
         </w:trPr>
         <w:tc>
           <w:tcPr>
-            <w:tcW w:w="2273" w:type="dxa"/>
+            <w:tcW w:w="1964" w:type="dxa"/>
           </w:tcPr>
           <w:p>
             <w:pPr>
               <w:keepNext/>
               <w:spacing w:line="240" w:lineRule="auto"/>
             </w:pPr>
-            <w:r>
-              <w:rPr>
-                <w:i/>
-                <w:sz w:val="24"/>
-              </w:rPr>
-              <w:t>Mac</w:t>
-            </w:r>
-            <w:r>
-              <w:rPr>
-                <w:sz w:val="24"/>
-              </w:rPr>
-              <w:t xml:space="preserve"> или </w:t>
-            </w:r>
             <w:r>
               <w:rPr>
                 <w:i/>
@@ -3963,7 +3941,7 @@
         </w:tc>
         <w:tc>
           <w:tcPr>
-            <w:tcW w:w="2898" w:type="dxa"/>
+            <w:tcW w:w="2991" w:type="dxa"/>
           </w:tcPr>
           <w:p>
             <w:pPr>
@@ -4000,7 +3978,7 @@
         </w:tc>
         <w:tc>
           <w:tcPr>
-            <w:tcW w:w="4183" w:type="dxa"/>
+            <w:tcW w:w="4399" w:type="dxa"/>
           </w:tcPr>
           <w:p>
             <w:pPr>
@@ -4023,7 +4001,7 @@
         </w:trPr>
         <w:tc>
           <w:tcPr>
-            <w:tcW w:w="2273" w:type="dxa"/>
+            <w:tcW w:w="1964" w:type="dxa"/>
           </w:tcPr>
           <w:p>
             <w:pPr>
@@ -4046,7 +4024,7 @@
         </w:tc>
         <w:tc>
           <w:tcPr>
-            <w:tcW w:w="2898" w:type="dxa"/>
+            <w:tcW w:w="2991" w:type="dxa"/>
           </w:tcPr>
           <w:p>
             <w:pPr>
@@ -4082,7 +4060,7 @@
         </w:tc>
         <w:tc>
           <w:tcPr>
-            <w:tcW w:w="4183" w:type="dxa"/>
+            <w:tcW w:w="4399" w:type="dxa"/>
           </w:tcPr>
           <w:p>
             <w:pPr>
@@ -4190,7 +4168,7 @@
           <w:noProof/>
         </w:rPr>
         <w:drawing>
-          <wp:inline distT="0" distB="0" distL="0" distR="0" wp14:anchorId="07720249" wp14:editId="3BCE60FE">
+          <wp:inline distT="0" distB="0" distL="0" distR="0" wp14:anchorId="4A553F45" wp14:editId="43690C0A">
             <wp:extent cx="5580000" cy="3817164"/>
             <wp:effectExtent l="0" t="0" r="0" b="0"/>
             <wp:docPr id="6" name="Picture 6"/>
@@ -4284,7 +4262,7 @@
         </w:rPr>
         <w:lastRenderedPageBreak/>
         <w:drawing>
-          <wp:inline distT="0" distB="0" distL="0" distR="0" wp14:anchorId="776BCC22" wp14:editId="7D8328B6">
+          <wp:inline distT="0" distB="0" distL="0" distR="0" wp14:anchorId="2FFFAA89" wp14:editId="7E3E0782">
             <wp:extent cx="5580000" cy="4566964"/>
             <wp:effectExtent l="0" t="0" r="0" b="0"/>
             <wp:docPr id="7" name="Picture 7"/>
@@ -4378,7 +4356,7 @@
         </w:rPr>
         <w:lastRenderedPageBreak/>
         <w:drawing>
-          <wp:inline distT="0" distB="0" distL="0" distR="0" wp14:anchorId="2BBDD1C5" wp14:editId="2C252B97">
+          <wp:inline distT="0" distB="0" distL="0" distR="0" wp14:anchorId="2CB2F9D8" wp14:editId="6927916F">
             <wp:extent cx="5580000" cy="3560156"/>
             <wp:effectExtent l="0" t="0" r="0" b="0"/>
             <wp:docPr id="8" name="Picture 8"/>
@@ -4449,7 +4427,7 @@
         <w:pStyle w:val="1"/>
         <w:ind w:firstLine="709"/>
       </w:pPr>
-      <w:bookmarkStart w:id="7" w:name="_Toc242386438"/>
+      <w:bookmarkStart w:id="7" w:name="_Toc242426573"/>
       <w:r>
         <w:rPr>
           <w:rFonts w:ascii="Times New Roman" w:hAnsi="Times New Roman"/>
@@ -4465,7 +4443,7 @@
         <w:spacing w:before="360"/>
         <w:ind w:firstLine="709"/>
       </w:pPr>
-      <w:bookmarkStart w:id="8" w:name="_Toc242386439"/>
+      <w:bookmarkStart w:id="8" w:name="_Toc242426574"/>
       <w:r>
         <w:rPr>
           <w:rFonts w:ascii="Times New Roman" w:hAnsi="Times New Roman"/>
@@ -4557,7 +4535,7 @@
         <w:spacing w:before="360"/>
         <w:ind w:firstLine="709"/>
       </w:pPr>
-      <w:bookmarkStart w:id="9" w:name="_Toc242386440"/>
+      <w:bookmarkStart w:id="9" w:name="_Toc242426575"/>
       <w:r>
         <w:rPr>
           <w:rFonts w:ascii="Times New Roman" w:hAnsi="Times New Roman"/>
@@ -4653,7 +4631,7 @@
         <w:spacing w:before="360"/>
         <w:ind w:firstLine="709"/>
       </w:pPr>
-      <w:bookmarkStart w:id="10" w:name="_Toc242386441"/>
+      <w:bookmarkStart w:id="10" w:name="_Toc242426576"/>
       <w:r>
         <w:rPr>
           <w:rFonts w:ascii="Times New Roman" w:hAnsi="Times New Roman"/>
@@ -4740,7 +4718,7 @@
         <w:spacing w:before="360"/>
         <w:ind w:firstLine="709"/>
       </w:pPr>
-      <w:bookmarkStart w:id="11" w:name="_Toc242386442"/>
+      <w:bookmarkStart w:id="11" w:name="_Toc242426577"/>
       <w:r>
         <w:rPr>
           <w:rFonts w:ascii="Times New Roman" w:hAnsi="Times New Roman"/>
@@ -4822,7 +4800,7 @@
         <w:pStyle w:val="1"/>
         <w:jc w:val="center"/>
       </w:pPr>
-      <w:bookmarkStart w:id="12" w:name="_Toc242386443"/>
+      <w:bookmarkStart w:id="12" w:name="_Toc242426578"/>
       <w:r>
         <w:rPr>
           <w:rFonts w:ascii="Times New Roman" w:hAnsi="Times New Roman"/>
@@ -5139,31 +5117,31 @@
       </w:rPr>
     </w:lvl>
   </w:abstractNum>
-  <w:num w:numId="1" w16cid:durableId="312105856">
+  <w:num w:numId="1" w16cid:durableId="1644851667">
     <w:abstractNumId w:val="8"/>
   </w:num>
-  <w:num w:numId="2" w16cid:durableId="2012679783">
+  <w:num w:numId="2" w16cid:durableId="972517901">
     <w:abstractNumId w:val="6"/>
   </w:num>
-  <w:num w:numId="3" w16cid:durableId="78911226">
+  <w:num w:numId="3" w16cid:durableId="1084569359">
     <w:abstractNumId w:val="5"/>
   </w:num>
-  <w:num w:numId="4" w16cid:durableId="232354485">
+  <w:num w:numId="4" w16cid:durableId="782921407">
     <w:abstractNumId w:val="4"/>
   </w:num>
-  <w:num w:numId="5" w16cid:durableId="1297373484">
+  <w:num w:numId="5" w16cid:durableId="1398551594">
     <w:abstractNumId w:val="7"/>
   </w:num>
-  <w:num w:numId="6" w16cid:durableId="425733669">
+  <w:num w:numId="6" w16cid:durableId="759256029">
     <w:abstractNumId w:val="3"/>
   </w:num>
-  <w:num w:numId="7" w16cid:durableId="488637520">
+  <w:num w:numId="7" w16cid:durableId="1056466727">
     <w:abstractNumId w:val="2"/>
   </w:num>
-  <w:num w:numId="8" w16cid:durableId="234510985">
+  <w:num w:numId="8" w16cid:durableId="1083068941">
     <w:abstractNumId w:val="1"/>
   </w:num>
-  <w:num w:numId="9" w16cid:durableId="1505851393">
+  <w:num w:numId="9" w16cid:durableId="661394823">
     <w:abstractNumId w:val="0"/>
   </w:num>
 </w:numbering>
@@ -16569,7 +16547,7 @@
     <w:autoRedefine/>
     <w:uiPriority w:val="39"/>
     <w:unhideWhenUsed/>
-    <w:rsid w:val="00E20BD1"/>
+    <w:rsid w:val="003B7081"/>
     <w:pPr>
       <w:spacing w:after="100"/>
     </w:pPr>
@@ -16581,7 +16559,7 @@
     <w:autoRedefine/>
     <w:uiPriority w:val="39"/>
     <w:unhideWhenUsed/>
-    <w:rsid w:val="00E20BD1"/>
+    <w:rsid w:val="003B7081"/>
     <w:pPr>
       <w:spacing w:after="100"/>
       <w:ind w:left="280"/>
@@ -16592,7 +16570,7 @@
     <w:basedOn w:val="a2"/>
     <w:uiPriority w:val="99"/>
     <w:unhideWhenUsed/>
-    <w:rsid w:val="00E20BD1"/>
+    <w:rsid w:val="003B7081"/>
     <w:rPr>
       <w:color w:val="0000FF" w:themeColor="hyperlink"/>
       <w:u w:val="single"/>

</xml_diff>